<commit_message>
docs: refine post-materialization consequence and define MVP
</commit_message>
<xml_diff>
--- a/docs/DOC-040 — Post-Materialization Economic Consequence Capability.docx
+++ b/docs/DOC-040 — Post-Materialization Economic Consequence Capability.docx
@@ -8815,7 +8815,7 @@
           <w:szCs w:val="46"/>
         </w:rPr>
       </w:pPr>
-      <w:bookmarkStart w:colFirst="0" w:colLast="0" w:name="_htyic23ohgqg" w:id="36"/>
+      <w:bookmarkStart w:colFirst="0" w:colLast="0" w:name="_ukn7qdxbcq63" w:id="36"/>
       <w:bookmarkEnd w:id="36"/>
       <w:r>
         <w:rPr>
@@ -8825,7 +8825,7 @@
           <w:szCs w:val="46"/>
           <w:rtl w:val="0"/>
         </w:rPr>
-        <w:t xml:space="preserve">24. Dirección de la consecuencia monetaria</w:t>
+        <w:t xml:space="preserve">24. Dirección algebraica de la consecuencia monetaria</w:t>
       </w:r>
     </w:p>
     <w:p>
@@ -8851,79 +8851,282 @@
         <w:rPr>
           <w:rtl w:val="0"/>
         </w:rPr>
-        <w:t xml:space="preserve"> determina el sentido de la consecuencia monetaria asociada a la materialización.</w:t>
-      </w:r>
-    </w:p>
-    <w:p>
-      <w:pPr>
-        <w:spacing w:after="240" w:before="240" w:lineRule="auto"/>
-        <w:rPr/>
-      </w:pPr>
-      <w:r>
-        <w:rPr>
-          <w:rtl w:val="0"/>
-        </w:rPr>
-        <w:t xml:space="preserve">Para:</w:t>
-      </w:r>
-    </w:p>
-    <w:p>
-      <w:pPr>
-        <w:rPr/>
-      </w:pPr>
-      <w:r>
-        <w:rPr>
+        <w:t xml:space="preserve"> determina la orientación algebraica aplicada a la magnitud monetaria asociada a la materialización.</w:t>
+      </w:r>
+    </w:p>
+    <w:p>
+      <w:pPr>
+        <w:spacing w:after="240" w:before="240" w:lineRule="auto"/>
+        <w:rPr/>
+      </w:pPr>
+      <w:r>
+        <w:rPr>
+          <w:rtl w:val="0"/>
+        </w:rPr>
+        <w:t xml:space="preserve">Para una materialización:</w:t>
+      </w:r>
+    </w:p>
+    <w:p>
+      <w:pPr>
+        <w:spacing w:after="240" w:before="240" w:lineRule="auto"/>
+        <w:rPr/>
+      </w:pPr>
+      <w:r>
+        <w:rPr>
+          <w:rtl w:val="0"/>
+        </w:rPr>
+        <w:t xml:space="preserve">BUY Q @ P C</w:t>
+      </w:r>
+    </w:p>
+    <w:p>
+      <w:pPr>
+        <w:spacing w:after="240" w:before="240" w:lineRule="auto"/>
+        <w:rPr/>
+      </w:pPr>
+      <w:r>
+        <w:rPr>
+          <w:rtl w:val="0"/>
+        </w:rPr>
+      </w:r>
+    </w:p>
+    <w:p>
+      <w:pPr>
+        <w:spacing w:after="240" w:before="240" w:lineRule="auto"/>
+        <w:rPr/>
+      </w:pPr>
+      <w:r>
+        <w:rPr>
+          <w:rtl w:val="0"/>
+        </w:rPr>
+        <w:t xml:space="preserve">la consecuencia monetaria reconocida está determinada conceptualmente por:</w:t>
+      </w:r>
+    </w:p>
+    <w:p>
+      <w:pPr>
+        <w:spacing w:after="240" w:before="240" w:lineRule="auto"/>
+        <w:rPr/>
+      </w:pPr>
+      <w:r>
+        <w:rPr>
+          <w:rtl w:val="0"/>
+        </w:rPr>
+        <w:t xml:space="preserve">-(Q × P) C</w:t>
+      </w:r>
+    </w:p>
+    <w:p>
+      <w:pPr>
+        <w:spacing w:after="240" w:before="240" w:lineRule="auto"/>
+        <w:rPr/>
+      </w:pPr>
+      <w:r>
+        <w:rPr>
+          <w:rtl w:val="0"/>
+        </w:rPr>
+      </w:r>
+    </w:p>
+    <w:p>
+      <w:pPr>
+        <w:spacing w:after="240" w:before="240" w:lineRule="auto"/>
+        <w:rPr/>
+      </w:pPr>
+      <w:r>
+        <w:rPr>
+          <w:rtl w:val="0"/>
+        </w:rPr>
+        <w:t xml:space="preserve">Para una materialización:</w:t>
+      </w:r>
+    </w:p>
+    <w:p>
+      <w:pPr>
+        <w:spacing w:after="240" w:before="240" w:lineRule="auto"/>
+        <w:rPr/>
+      </w:pPr>
+      <w:r>
+        <w:rPr>
+          <w:rtl w:val="0"/>
+        </w:rPr>
+        <w:t xml:space="preserve">SELL Q @ P C</w:t>
+      </w:r>
+    </w:p>
+    <w:p>
+      <w:pPr>
+        <w:spacing w:after="240" w:before="240" w:lineRule="auto"/>
+        <w:rPr/>
+      </w:pPr>
+      <w:r>
+        <w:rPr>
+          <w:rtl w:val="0"/>
+        </w:rPr>
+      </w:r>
+    </w:p>
+    <w:p>
+      <w:pPr>
+        <w:spacing w:after="240" w:before="240" w:lineRule="auto"/>
+        <w:rPr/>
+      </w:pPr>
+      <w:r>
+        <w:rPr>
+          <w:rtl w:val="0"/>
+        </w:rPr>
+        <w:t xml:space="preserve">la consecuencia monetaria reconocida está determinada conceptualmente por:</w:t>
+      </w:r>
+    </w:p>
+    <w:p>
+      <w:pPr>
+        <w:spacing w:after="240" w:before="240" w:lineRule="auto"/>
+        <w:rPr/>
+      </w:pPr>
+      <w:r>
+        <w:rPr>
+          <w:rtl w:val="0"/>
+        </w:rPr>
+        <w:t xml:space="preserve">+(Q × P) C</w:t>
+      </w:r>
+    </w:p>
+    <w:p>
+      <w:pPr>
+        <w:spacing w:after="240" w:before="240" w:lineRule="auto"/>
+        <w:rPr/>
+      </w:pPr>
+      <w:r>
+        <w:rPr>
+          <w:rtl w:val="0"/>
+        </w:rPr>
+      </w:r>
+    </w:p>
+    <w:p>
+      <w:pPr>
+        <w:spacing w:after="240" w:before="240" w:lineRule="auto"/>
+        <w:rPr/>
+      </w:pPr>
+      <w:r>
+        <w:rPr>
+          <w:rtl w:val="0"/>
+        </w:rPr>
+        <w:t xml:space="preserve">Por tanto, </w:t>
+      </w:r>
+      <w:r>
+        <w:rPr>
+          <w:rFonts w:ascii="Roboto Mono" w:cs="Roboto Mono" w:eastAsia="Roboto Mono" w:hAnsi="Roboto Mono"/>
+          <w:color w:val="188038"/>
           <w:rtl w:val="0"/>
         </w:rPr>
         <w:t xml:space="preserve">BUY</w:t>
       </w:r>
-    </w:p>
-    <w:p>
-      <w:pPr>
-        <w:rPr/>
-      </w:pPr>
-      <w:r>
-        <w:rPr>
-          <w:rtl w:val="0"/>
-        </w:rPr>
-      </w:r>
-    </w:p>
-    <w:p>
-      <w:pPr>
-        <w:spacing w:after="240" w:before="240" w:lineRule="auto"/>
-        <w:rPr/>
-      </w:pPr>
-      <w:r>
-        <w:rPr>
-          <w:rtl w:val="0"/>
-        </w:rPr>
-        <w:t xml:space="preserve">la consecuencia monetaria es negativa.</w:t>
-      </w:r>
-    </w:p>
-    <w:p>
-      <w:pPr>
-        <w:spacing w:after="240" w:before="240" w:lineRule="auto"/>
-        <w:rPr/>
-      </w:pPr>
-      <w:r>
-        <w:rPr>
-          <w:rtl w:val="0"/>
-        </w:rPr>
-        <w:t xml:space="preserve">Conceptualmente:</w:t>
-      </w:r>
-    </w:p>
-    <w:p>
-      <w:pPr>
-        <w:rPr/>
-      </w:pPr>
-      <w:r>
-        <w:rPr>
-          <w:rtl w:val="0"/>
-        </w:rPr>
-        <w:t xml:space="preserve">BUY Q @ P C</w:t>
-      </w:r>
-    </w:p>
-    <w:p>
-      <w:pPr>
+      <w:r>
+        <w:rPr>
+          <w:rtl w:val="0"/>
+        </w:rPr>
+        <w:t xml:space="preserve"> y </w:t>
+      </w:r>
+      <w:r>
+        <w:rPr>
+          <w:rFonts w:ascii="Roboto Mono" w:cs="Roboto Mono" w:eastAsia="Roboto Mono" w:hAnsi="Roboto Mono"/>
+          <w:color w:val="188038"/>
+          <w:rtl w:val="0"/>
+        </w:rPr>
+        <w:t xml:space="preserve">SELL</w:t>
+      </w:r>
+      <w:r>
+        <w:rPr>
+          <w:rtl w:val="0"/>
+        </w:rPr>
+        <w:t xml:space="preserve"> determinan el operador algebraico aplicado a </w:t>
+      </w:r>
+      <w:r>
+        <w:rPr>
+          <w:rFonts w:ascii="Roboto Mono" w:cs="Roboto Mono" w:eastAsia="Roboto Mono" w:hAnsi="Roboto Mono"/>
+          <w:color w:val="188038"/>
+          <w:rtl w:val="0"/>
+        </w:rPr>
+        <w:t xml:space="preserve">quantity × price</w:t>
+      </w:r>
+      <w:r>
+        <w:rPr>
+          <w:rtl w:val="0"/>
+        </w:rPr>
+        <w:t xml:space="preserve">.</w:t>
+      </w:r>
+    </w:p>
+    <w:p>
+      <w:pPr>
+        <w:spacing w:after="240" w:before="240" w:lineRule="auto"/>
+        <w:rPr/>
+      </w:pPr>
+      <w:r>
+        <w:rPr>
+          <w:rtl w:val="0"/>
+        </w:rPr>
+        <w:t xml:space="preserve">No establecen por sí mismos una garantía independiente sobre el signo final del resultado monetario.</w:t>
+      </w:r>
+    </w:p>
+    <w:p>
+      <w:pPr>
+        <w:spacing w:after="240" w:before="240" w:lineRule="auto"/>
+        <w:rPr/>
+      </w:pPr>
+      <w:r>
+        <w:rPr>
+          <w:rtl w:val="0"/>
+        </w:rPr>
+        <w:t xml:space="preserve">El signo resultante depende también del valor contractual de </w:t>
+      </w:r>
+      <w:r>
+        <w:rPr>
+          <w:rFonts w:ascii="Roboto Mono" w:cs="Roboto Mono" w:eastAsia="Roboto Mono" w:hAnsi="Roboto Mono"/>
+          <w:color w:val="188038"/>
+          <w:rtl w:val="0"/>
+        </w:rPr>
+        <w:t xml:space="preserve">price</w:t>
+      </w:r>
+      <w:r>
+        <w:rPr>
+          <w:rtl w:val="0"/>
+        </w:rPr>
+        <w:t xml:space="preserve">, que conforme a la autoridad vigente de </w:t>
+      </w:r>
+      <w:r>
+        <w:rPr>
+          <w:rFonts w:ascii="Roboto Mono" w:cs="Roboto Mono" w:eastAsia="Roboto Mono" w:hAnsi="Roboto Mono"/>
+          <w:color w:val="188038"/>
+          <w:rtl w:val="0"/>
+        </w:rPr>
+        <w:t xml:space="preserve">OperationalMaterialization</w:t>
+      </w:r>
+      <w:r>
+        <w:rPr>
+          <w:rtl w:val="0"/>
+        </w:rPr>
+        <w:t xml:space="preserve"> puede ser positivo, cero o negativo siempre que satisfaga sus invariantes contractuales.</w:t>
+      </w:r>
+    </w:p>
+    <w:p>
+      <w:pPr>
+        <w:spacing w:after="240" w:before="240" w:lineRule="auto"/>
+        <w:rPr/>
+      </w:pPr>
+      <w:r>
+        <w:rPr>
+          <w:rtl w:val="0"/>
+        </w:rPr>
+        <w:t xml:space="preserve">Por ejemplo:</w:t>
+      </w:r>
+    </w:p>
+    <w:p>
+      <w:pPr>
+        <w:spacing w:after="240" w:before="240" w:lineRule="auto"/>
+        <w:rPr/>
+      </w:pPr>
+      <w:r>
+        <w:rPr>
+          <w:rtl w:val="0"/>
+        </w:rPr>
+        <w:t xml:space="preserve">BUY 10 @ 5</w:t>
+      </w:r>
+    </w:p>
+    <w:p>
+      <w:pPr>
+        <w:spacing w:after="240" w:before="240" w:lineRule="auto"/>
         <w:rPr/>
       </w:pPr>
       <w:r>
@@ -8931,107 +9134,155 @@
           <w:rFonts w:ascii="Arial Unicode MS" w:cs="Arial Unicode MS" w:eastAsia="Arial Unicode MS" w:hAnsi="Arial Unicode MS"/>
           <w:rtl w:val="0"/>
         </w:rPr>
-        <w:t xml:space="preserve">→ -(Q × P) C</w:t>
-      </w:r>
-    </w:p>
-    <w:p>
-      <w:pPr>
-        <w:rPr/>
-      </w:pPr>
-      <w:r>
-        <w:rPr>
-          <w:rtl w:val="0"/>
-        </w:rPr>
-      </w:r>
-    </w:p>
-    <w:p>
-      <w:pPr>
-        <w:spacing w:after="240" w:before="240" w:lineRule="auto"/>
-        <w:rPr/>
-      </w:pPr>
-      <w:r>
-        <w:rPr>
-          <w:rtl w:val="0"/>
-        </w:rPr>
-        <w:t xml:space="preserve">Para:</w:t>
-      </w:r>
-    </w:p>
-    <w:p>
-      <w:pPr>
-        <w:rPr/>
-      </w:pPr>
-      <w:r>
-        <w:rPr>
+        <w:t xml:space="preserve">→ -(10 × 5)</w:t>
+      </w:r>
+    </w:p>
+    <w:p>
+      <w:pPr>
+        <w:spacing w:after="240" w:before="240" w:lineRule="auto"/>
+        <w:rPr/>
+      </w:pPr>
+      <w:r>
+        <w:rPr>
+          <w:rFonts w:ascii="Arial Unicode MS" w:cs="Arial Unicode MS" w:eastAsia="Arial Unicode MS" w:hAnsi="Arial Unicode MS"/>
+          <w:rtl w:val="0"/>
+        </w:rPr>
+        <w:t xml:space="preserve">→ -50</w:t>
+      </w:r>
+    </w:p>
+    <w:p>
+      <w:pPr>
+        <w:spacing w:after="240" w:before="240" w:lineRule="auto"/>
+        <w:rPr/>
+      </w:pPr>
+      <w:r>
+        <w:rPr>
+          <w:rtl w:val="0"/>
+        </w:rPr>
+      </w:r>
+    </w:p>
+    <w:p>
+      <w:pPr>
+        <w:spacing w:after="240" w:before="240" w:lineRule="auto"/>
+        <w:rPr/>
+      </w:pPr>
+      <w:r>
+        <w:rPr>
+          <w:rtl w:val="0"/>
+        </w:rPr>
+        <w:t xml:space="preserve">BUY 10 @ 0</w:t>
+      </w:r>
+    </w:p>
+    <w:p>
+      <w:pPr>
+        <w:spacing w:after="240" w:before="240" w:lineRule="auto"/>
+        <w:rPr/>
+      </w:pPr>
+      <w:r>
+        <w:rPr>
+          <w:rFonts w:ascii="Arial Unicode MS" w:cs="Arial Unicode MS" w:eastAsia="Arial Unicode MS" w:hAnsi="Arial Unicode MS"/>
+          <w:rtl w:val="0"/>
+        </w:rPr>
+        <w:t xml:space="preserve">→ -(10 × 0)</w:t>
+      </w:r>
+    </w:p>
+    <w:p>
+      <w:pPr>
+        <w:spacing w:after="240" w:before="240" w:lineRule="auto"/>
+        <w:rPr/>
+      </w:pPr>
+      <w:r>
+        <w:rPr>
+          <w:rFonts w:ascii="Arial Unicode MS" w:cs="Arial Unicode MS" w:eastAsia="Arial Unicode MS" w:hAnsi="Arial Unicode MS"/>
+          <w:rtl w:val="0"/>
+        </w:rPr>
+        <w:t xml:space="preserve">→ 0</w:t>
+      </w:r>
+    </w:p>
+    <w:p>
+      <w:pPr>
+        <w:spacing w:after="240" w:before="240" w:lineRule="auto"/>
+        <w:rPr/>
+      </w:pPr>
+      <w:r>
+        <w:rPr>
+          <w:rtl w:val="0"/>
+        </w:rPr>
+      </w:r>
+    </w:p>
+    <w:p>
+      <w:pPr>
+        <w:spacing w:after="240" w:before="240" w:lineRule="auto"/>
+        <w:rPr/>
+      </w:pPr>
+      <w:r>
+        <w:rPr>
+          <w:rtl w:val="0"/>
+        </w:rPr>
+        <w:t xml:space="preserve">BUY 10 @ -5</w:t>
+      </w:r>
+    </w:p>
+    <w:p>
+      <w:pPr>
+        <w:spacing w:after="240" w:before="240" w:lineRule="auto"/>
+        <w:rPr/>
+      </w:pPr>
+      <w:r>
+        <w:rPr>
+          <w:rFonts w:ascii="Arial Unicode MS" w:cs="Arial Unicode MS" w:eastAsia="Arial Unicode MS" w:hAnsi="Arial Unicode MS"/>
+          <w:rtl w:val="0"/>
+        </w:rPr>
+        <w:t xml:space="preserve">→ -(10 × -5)</w:t>
+      </w:r>
+    </w:p>
+    <w:p>
+      <w:pPr>
+        <w:spacing w:after="240" w:before="240" w:lineRule="auto"/>
+        <w:rPr/>
+      </w:pPr>
+      <w:r>
+        <w:rPr>
+          <w:rFonts w:ascii="Arial Unicode MS" w:cs="Arial Unicode MS" w:eastAsia="Arial Unicode MS" w:hAnsi="Arial Unicode MS"/>
+          <w:rtl w:val="0"/>
+        </w:rPr>
+        <w:t xml:space="preserve">→ +50</w:t>
+      </w:r>
+    </w:p>
+    <w:p>
+      <w:pPr>
+        <w:spacing w:after="240" w:before="240" w:lineRule="auto"/>
+        <w:rPr/>
+      </w:pPr>
+      <w:r>
+        <w:rPr>
+          <w:rtl w:val="0"/>
+        </w:rPr>
+      </w:r>
+    </w:p>
+    <w:p>
+      <w:pPr>
+        <w:spacing w:after="240" w:before="240" w:lineRule="auto"/>
+        <w:rPr/>
+      </w:pPr>
+      <w:r>
+        <w:rPr>
+          <w:rtl w:val="0"/>
+        </w:rPr>
+        <w:t xml:space="preserve">La misma regla algebraica aplica simétricamente a </w:t>
+      </w:r>
+      <w:r>
+        <w:rPr>
+          <w:rFonts w:ascii="Roboto Mono" w:cs="Roboto Mono" w:eastAsia="Roboto Mono" w:hAnsi="Roboto Mono"/>
+          <w:color w:val="188038"/>
           <w:rtl w:val="0"/>
         </w:rPr>
         <w:t xml:space="preserve">SELL</w:t>
       </w:r>
-    </w:p>
-    <w:p>
-      <w:pPr>
-        <w:rPr/>
-      </w:pPr>
-      <w:r>
-        <w:rPr>
-          <w:rtl w:val="0"/>
-        </w:rPr>
-      </w:r>
-    </w:p>
-    <w:p>
-      <w:pPr>
-        <w:spacing w:after="240" w:before="240" w:lineRule="auto"/>
-        <w:rPr/>
-      </w:pPr>
-      <w:r>
-        <w:rPr>
-          <w:rtl w:val="0"/>
-        </w:rPr>
-        <w:t xml:space="preserve">la consecuencia monetaria es positiva.</w:t>
-      </w:r>
-    </w:p>
-    <w:p>
-      <w:pPr>
-        <w:spacing w:after="240" w:before="240" w:lineRule="auto"/>
-        <w:rPr/>
-      </w:pPr>
-      <w:r>
-        <w:rPr>
-          <w:rtl w:val="0"/>
-        </w:rPr>
-        <w:t xml:space="preserve">Conceptualmente:</w:t>
-      </w:r>
-    </w:p>
-    <w:p>
-      <w:pPr>
-        <w:rPr/>
-      </w:pPr>
-      <w:r>
-        <w:rPr>
-          <w:rtl w:val="0"/>
-        </w:rPr>
-        <w:t xml:space="preserve">SELL Q @ P C</w:t>
-      </w:r>
-    </w:p>
-    <w:p>
-      <w:pPr>
-        <w:rPr/>
-      </w:pPr>
-      <w:r>
-        <w:rPr>
-          <w:rFonts w:ascii="Arial Unicode MS" w:cs="Arial Unicode MS" w:eastAsia="Arial Unicode MS" w:hAnsi="Arial Unicode MS"/>
-          <w:rtl w:val="0"/>
-        </w:rPr>
-        <w:t xml:space="preserve">→ +(Q × P) C</w:t>
-      </w:r>
-    </w:p>
-    <w:p>
-      <w:pPr>
-        <w:rPr/>
-      </w:pPr>
-      <w:r>
-        <w:rPr>
-          <w:rtl w:val="0"/>
-        </w:rPr>
+      <w:r>
+        <w:rPr>
+          <w:rtl w:val="0"/>
+        </w:rPr>
+        <w:t xml:space="preserve">.</w:t>
       </w:r>
     </w:p>
     <w:p>
@@ -9056,6 +9307,17 @@
           <w:rtl w:val="0"/>
         </w:rPr>
         <w:t xml:space="preserve">No constituye una afirmación de settlement.</w:t>
+      </w:r>
+    </w:p>
+    <w:p>
+      <w:pPr>
+        <w:spacing w:after="240" w:before="240" w:lineRule="auto"/>
+        <w:rPr/>
+      </w:pPr>
+      <w:r>
+        <w:rPr>
+          <w:rtl w:val="0"/>
+        </w:rPr>
       </w:r>
     </w:p>
     <w:p>
@@ -13500,7 +13762,7 @@
           <w:szCs w:val="26"/>
         </w:rPr>
       </w:pPr>
-      <w:bookmarkStart w:colFirst="0" w:colLast="0" w:name="_rlc5bzcyo05n" w:id="60"/>
+      <w:bookmarkStart w:colFirst="0" w:colLast="0" w:name="_s3bg0af4bawk" w:id="60"/>
       <w:bookmarkEnd w:id="60"/>
       <w:r>
         <w:rPr>
@@ -13511,27 +13773,33 @@
           <w:szCs w:val="26"/>
           <w:rtl w:val="0"/>
         </w:rPr>
-        <w:t xml:space="preserve">CO-040-007 — Dirección monetaria</w:t>
-      </w:r>
-    </w:p>
-    <w:p>
-      <w:pPr>
-        <w:spacing w:after="240" w:before="240" w:lineRule="auto"/>
-        <w:rPr/>
-      </w:pPr>
+        <w:t xml:space="preserve">CO-040-007 — Dirección algebraica monetaria</w:t>
+      </w:r>
+    </w:p>
+    <w:p>
+      <w:pPr>
+        <w:spacing w:after="240" w:before="240" w:lineRule="auto"/>
+        <w:rPr/>
+      </w:pPr>
+      <w:r>
+        <w:rPr>
+          <w:rtl w:val="0"/>
+        </w:rPr>
+        <w:t xml:space="preserve">La dirección de la </w:t>
+      </w:r>
       <w:r>
         <w:rPr>
           <w:rFonts w:ascii="Roboto Mono" w:cs="Roboto Mono" w:eastAsia="Roboto Mono" w:hAnsi="Roboto Mono"/>
           <w:color w:val="188038"/>
           <w:rtl w:val="0"/>
         </w:rPr>
-        <w:t xml:space="preserve">BUY</w:t>
-      </w:r>
-      <w:r>
-        <w:rPr>
-          <w:rtl w:val="0"/>
-        </w:rPr>
-        <w:t xml:space="preserve"> produce consecuencia monetaria negativa y </w:t>
+        <w:t xml:space="preserve">InvestmentOperation</w:t>
+      </w:r>
+      <w:r>
+        <w:rPr>
+          <w:rtl w:val="0"/>
+        </w:rPr>
+        <w:t xml:space="preserve"> determina el operador algebraico aplicado a la magnitud </w:t>
       </w:r>
       <w:r>
         <w:rPr>
@@ -13539,13 +13807,73 @@
           <w:color w:val="188038"/>
           <w:rtl w:val="0"/>
         </w:rPr>
-        <w:t xml:space="preserve">SELL</w:t>
-      </w:r>
-      <w:r>
-        <w:rPr>
-          <w:rtl w:val="0"/>
-        </w:rPr>
-        <w:t xml:space="preserve"> produce consecuencia monetaria positiva.</w:t>
+        <w:t xml:space="preserve">quantity × price</w:t>
+      </w:r>
+      <w:r>
+        <w:rPr>
+          <w:rtl w:val="0"/>
+        </w:rPr>
+        <w:t xml:space="preserve">:</w:t>
+      </w:r>
+    </w:p>
+    <w:p>
+      <w:pPr>
+        <w:spacing w:after="240" w:before="240" w:lineRule="auto"/>
+        <w:rPr/>
+      </w:pPr>
+      <w:r>
+        <w:rPr>
+          <w:rFonts w:ascii="Arial Unicode MS" w:cs="Arial Unicode MS" w:eastAsia="Arial Unicode MS" w:hAnsi="Arial Unicode MS"/>
+          <w:rtl w:val="0"/>
+        </w:rPr>
+        <w:t xml:space="preserve">BUY  → -(quantity × price)</w:t>
+      </w:r>
+    </w:p>
+    <w:p>
+      <w:pPr>
+        <w:spacing w:after="240" w:before="240" w:lineRule="auto"/>
+        <w:rPr/>
+      </w:pPr>
+      <w:r>
+        <w:rPr>
+          <w:rFonts w:ascii="Arial Unicode MS" w:cs="Arial Unicode MS" w:eastAsia="Arial Unicode MS" w:hAnsi="Arial Unicode MS"/>
+          <w:rtl w:val="0"/>
+        </w:rPr>
+        <w:t xml:space="preserve">SELL → +(quantity × price)</w:t>
+      </w:r>
+    </w:p>
+    <w:p>
+      <w:pPr>
+        <w:spacing w:after="240" w:before="240" w:lineRule="auto"/>
+        <w:rPr>
+          <w:rFonts w:ascii="Roboto Mono" w:cs="Roboto Mono" w:eastAsia="Roboto Mono" w:hAnsi="Roboto Mono"/>
+          <w:color w:val="188038"/>
+        </w:rPr>
+      </w:pPr>
+      <w:r>
+        <w:rPr>
+          <w:rtl w:val="0"/>
+        </w:rPr>
+        <w:t xml:space="preserve">La dirección operacional no establece por sí misma una garantía sobre el signo final de la consecuencia monetaria; dicho signo depende también del valor contractual de </w:t>
+      </w:r>
+      <w:r>
+        <w:rPr>
+          <w:rFonts w:ascii="Roboto Mono" w:cs="Roboto Mono" w:eastAsia="Roboto Mono" w:hAnsi="Roboto Mono"/>
+          <w:color w:val="188038"/>
+          <w:rtl w:val="0"/>
+        </w:rPr>
+        <w:t xml:space="preserve">price</w:t>
+      </w:r>
+    </w:p>
+    <w:p>
+      <w:pPr>
+        <w:spacing w:after="240" w:before="240" w:lineRule="auto"/>
+        <w:rPr/>
+      </w:pPr>
+      <w:r>
+        <w:rPr>
+          <w:rtl w:val="0"/>
+        </w:rPr>
       </w:r>
     </w:p>
     <w:p>
@@ -21696,7 +22024,7 @@
         <w:rPr>
           <w:rtl w:val="0"/>
         </w:rPr>
-        <w:t xml:space="preserve">aplica dirección monetaria negativa para </w:t>
+        <w:t xml:space="preserve">para </w:t>
       </w:r>
       <w:r>
         <w:rPr>
@@ -21710,23 +22038,7 @@
         <w:rPr>
           <w:rtl w:val="0"/>
         </w:rPr>
-        <w:t xml:space="preserve">;</w:t>
-      </w:r>
-    </w:p>
-    <w:p>
-      <w:pPr>
-        <w:numPr>
-          <w:ilvl w:val="0"/>
-          <w:numId w:val="32"/>
-        </w:numPr>
-        <w:spacing w:after="0" w:afterAutospacing="0" w:before="0" w:beforeAutospacing="0" w:lineRule="auto"/>
-        <w:ind w:left="720" w:hanging="360"/>
-      </w:pPr>
-      <w:r>
-        <w:rPr>
-          <w:rtl w:val="0"/>
-        </w:rPr>
-        <w:t xml:space="preserve">aplica dirección monetaria positiva para </w:t>
+        <w:t xml:space="preserve">, aplica el inverso aditivo de </w:t>
       </w:r>
       <w:r>
         <w:rPr>
@@ -21734,7 +22046,51 @@
           <w:color w:val="188038"/>
           <w:rtl w:val="0"/>
         </w:rPr>
+        <w:t xml:space="preserve">quantity × price</w:t>
+      </w:r>
+      <w:r>
+        <w:rPr>
+          <w:rtl w:val="0"/>
+        </w:rPr>
+        <w:t xml:space="preserve">;</w:t>
+      </w:r>
+    </w:p>
+    <w:p>
+      <w:pPr>
+        <w:numPr>
+          <w:ilvl w:val="0"/>
+          <w:numId w:val="32"/>
+        </w:numPr>
+        <w:spacing w:after="0" w:afterAutospacing="0" w:before="0" w:beforeAutospacing="0" w:lineRule="auto"/>
+        <w:ind w:left="720" w:hanging="360"/>
+      </w:pPr>
+      <w:r>
+        <w:rPr>
+          <w:rtl w:val="0"/>
+        </w:rPr>
+        <w:t xml:space="preserve">para </w:t>
+      </w:r>
+      <w:r>
+        <w:rPr>
+          <w:rFonts w:ascii="Roboto Mono" w:cs="Roboto Mono" w:eastAsia="Roboto Mono" w:hAnsi="Roboto Mono"/>
+          <w:color w:val="188038"/>
+          <w:rtl w:val="0"/>
+        </w:rPr>
         <w:t xml:space="preserve">SELL</w:t>
+      </w:r>
+      <w:r>
+        <w:rPr>
+          <w:rtl w:val="0"/>
+        </w:rPr>
+        <w:t xml:space="preserve">, aplica algebraicamente </w:t>
+      </w:r>
+      <w:r>
+        <w:rPr>
+          <w:rFonts w:ascii="Roboto Mono" w:cs="Roboto Mono" w:eastAsia="Roboto Mono" w:hAnsi="Roboto Mono"/>
+          <w:color w:val="188038"/>
+          <w:rtl w:val="0"/>
+        </w:rPr>
+        <w:t xml:space="preserve">quantity × price</w:t>
       </w:r>
       <w:r>
         <w:rPr>

</xml_diff>